<commit_message>
excel challenge 2nd attempt
</commit_message>
<xml_diff>
--- a/Crowddunding_Assigment.docx
+++ b/Crowddunding_Assigment.docx
@@ -1,112 +1,195 @@
 
 <file path=word/document.xml><?xml version="1.0" encoding="utf-8"?>
-<w:document xmlns:wpc="http://schemas.microsoft.com/office/word/2010/wordprocessingCanvas" xmlns:cx="http://schemas.microsoft.com/office/drawing/2014/chartex" xmlns:cx1="http://schemas.microsoft.com/office/drawing/2015/9/8/chartex" xmlns:cx2="http://schemas.microsoft.com/office/drawing/2015/10/21/chartex" xmlns:cx3="http://schemas.microsoft.com/office/drawing/2016/5/9/chartex" xmlns:cx4="http://schemas.microsoft.com/office/drawing/2016/5/10/chartex" xmlns:cx5="http://schemas.microsoft.com/office/drawing/2016/5/11/chartex" xmlns:cx6="http://schemas.microsoft.com/office/drawing/2016/5/12/chartex" xmlns:cx7="http://schemas.microsoft.com/office/drawing/2016/5/13/chartex" xmlns:cx8="http://schemas.microsoft.com/office/drawing/2016/5/14/chartex" xmlns:mc="http://schemas.openxmlformats.org/markup-compatibility/2006" xmlns:aink="http://schemas.microsoft.com/office/drawing/2016/ink" xmlns:am3d="http://schemas.microsoft.com/office/drawing/2017/model3d" xmlns:o="urn:schemas-microsoft-com:office:office" xmlns:oel="http://schemas.microsoft.com/office/2019/extlst" xmlns:r="http://schemas.openxmlformats.org/officeDocument/2006/relationships" xmlns:m="http://schemas.openxmlformats.org/officeDocument/2006/math" xmlns:v="urn:schemas-microsoft-com:vml" xmlns:wp14="http://schemas.microsoft.com/office/word/2010/wordprocessingDrawing" xmlns:wp="http://schemas.openxmlformats.org/drawingml/2006/wordprocessingDrawing" xmlns:w10="urn:schemas-microsoft-com:office:word" xmlns:w="http://schemas.openxmlformats.org/wordprocessingml/2006/main" xmlns:w14="http://schemas.microsoft.com/office/word/2010/wordml" xmlns:w15="http://schemas.microsoft.com/office/word/2012/wordml" xmlns:w16cex="http://schemas.microsoft.com/office/word/2018/wordml/cex" xmlns:w16cid="http://schemas.microsoft.com/office/word/2016/wordml/cid" xmlns:w16="http://schemas.microsoft.com/office/word/2018/wordml" xmlns:w16du="http://schemas.microsoft.com/office/word/2023/wordml/word16du" xmlns:w16sdtdh="http://schemas.microsoft.com/office/word/2020/wordml/sdtdatahash" xmlns:w16se="http://schemas.microsoft.com/office/word/2015/wordml/symex" xmlns:wpg="http://schemas.microsoft.com/office/word/2010/wordprocessingGroup" xmlns:wpi="http://schemas.microsoft.com/office/word/2010/wordprocessingInk" xmlns:wne="http://schemas.microsoft.com/office/word/2006/wordml" xmlns:wps="http://schemas.microsoft.com/office/word/2010/wordprocessingShape" mc:Ignorable="w14 w15 w16se w16cid w16 w16cex w16sdtdh w16du wp14">
+<w:document xmlns:wpc="http://schemas.microsoft.com/office/word/2010/wordprocessingCanvas" xmlns:cx="http://schemas.microsoft.com/office/drawing/2014/chartex" xmlns:cx1="http://schemas.microsoft.com/office/drawing/2015/9/8/chartex" xmlns:cx2="http://schemas.microsoft.com/office/drawing/2015/10/21/chartex" xmlns:cx3="http://schemas.microsoft.com/office/drawing/2016/5/9/chartex" xmlns:cx4="http://schemas.microsoft.com/office/drawing/2016/5/10/chartex" xmlns:cx5="http://schemas.microsoft.com/office/drawing/2016/5/11/chartex" xmlns:cx6="http://schemas.microsoft.com/office/drawing/2016/5/12/chartex" xmlns:cx7="http://schemas.microsoft.com/office/drawing/2016/5/13/chartex" xmlns:cx8="http://schemas.microsoft.com/office/drawing/2016/5/14/chartex" xmlns:mc="http://schemas.openxmlformats.org/markup-compatibility/2006" xmlns:aink="http://schemas.microsoft.com/office/drawing/2016/ink" xmlns:am3d="http://schemas.microsoft.com/office/drawing/2017/model3d" xmlns:o="urn:schemas-microsoft-com:office:office" xmlns:oel="http://schemas.microsoft.com/office/2019/extlst" xmlns:r="http://schemas.openxmlformats.org/officeDocument/2006/relationships" xmlns:m="http://schemas.openxmlformats.org/officeDocument/2006/math" xmlns:v="urn:schemas-microsoft-com:vml" xmlns:wp14="http://schemas.microsoft.com/office/word/2010/wordprocessingDrawing" xmlns:wp="http://schemas.openxmlformats.org/drawingml/2006/wordprocessingDrawing" xmlns:w10="urn:schemas-microsoft-com:office:word" xmlns:w="http://schemas.openxmlformats.org/wordprocessingml/2006/main" xmlns:w14="http://schemas.microsoft.com/office/word/2010/wordml" xmlns:w15="http://schemas.microsoft.com/office/word/2012/wordml" xmlns:w16cex="http://schemas.microsoft.com/office/word/2018/wordml/cex" xmlns:w16cid="http://schemas.microsoft.com/office/word/2016/wordml/cid" xmlns:w16="http://schemas.microsoft.com/office/word/2018/wordml" xmlns:w16du="http://schemas.microsoft.com/office/word/2023/wordml/word16du" xmlns:w16sdtdh="http://schemas.microsoft.com/office/word/2020/wordml/sdtdatahash" xmlns:w16sdtfl="http://schemas.microsoft.com/office/word/2024/wordml/sdtformatlock" xmlns:w16se="http://schemas.microsoft.com/office/word/2015/wordml/symex" xmlns:wpg="http://schemas.microsoft.com/office/word/2010/wordprocessingGroup" xmlns:wpi="http://schemas.microsoft.com/office/word/2010/wordprocessingInk" xmlns:wne="http://schemas.microsoft.com/office/word/2006/wordml" xmlns:wps="http://schemas.microsoft.com/office/word/2010/wordprocessingShape" mc:Ignorable="w14 w15 w16se w16cid w16 w16cex w16sdtdh w16sdtfl w16du wp14">
   <w:body>
     <w:p>
       <w:pPr>
-        <w:numPr>
-          <w:ilvl w:val="0"/>
-          <w:numId w:val="1"/>
-        </w:numPr>
         <w:spacing w:line="480" w:lineRule="auto"/>
-        <w:rPr>
+        <w:jc w:val="center"/>
+        <w:rPr>
+          <w:rFonts w:cstheme="minorHAnsi"/>
+          <w:b/>
+          <w:bCs/>
           <w:sz w:val="24"/>
           <w:szCs w:val="24"/>
         </w:rPr>
       </w:pPr>
       <w:r>
         <w:rPr>
-          <w:sz w:val="24"/>
-          <w:szCs w:val="24"/>
-        </w:rPr>
-        <w:t xml:space="preserve">Given the provided data, what are three conclusions that we can draw about crowdfunding campaigns? </w:t>
+          <w:rFonts w:cstheme="minorHAnsi"/>
+          <w:b/>
+          <w:bCs/>
+          <w:sz w:val="24"/>
+          <w:szCs w:val="24"/>
+        </w:rPr>
+        <w:t>Crowd funding</w:t>
+      </w:r>
+      <w:r>
+        <w:rPr>
+          <w:rFonts w:cstheme="minorHAnsi"/>
+          <w:b/>
+          <w:bCs/>
+          <w:sz w:val="24"/>
+          <w:szCs w:val="24"/>
+        </w:rPr>
+        <w:t xml:space="preserve"> Analysis</w:t>
       </w:r>
     </w:p>
     <w:p>
       <w:pPr>
+        <w:tabs>
+          <w:tab w:val="num" w:pos="720"/>
+        </w:tabs>
         <w:spacing w:line="480" w:lineRule="auto"/>
-        <w:ind w:left="1080"/>
-        <w:rPr>
+        <w:ind w:left="720" w:hanging="360"/>
+        <w:jc w:val="center"/>
+        <w:rPr>
+          <w:rFonts w:cstheme="minorHAnsi"/>
+          <w:b/>
+          <w:bCs/>
+          <w:sz w:val="24"/>
+          <w:szCs w:val="24"/>
+        </w:rPr>
+      </w:pPr>
+    </w:p>
+    <w:p>
+      <w:pPr>
+        <w:spacing w:line="480" w:lineRule="auto"/>
+        <w:rPr>
+          <w:rFonts w:cstheme="minorHAnsi"/>
+          <w:b/>
+          <w:bCs/>
           <w:sz w:val="24"/>
           <w:szCs w:val="24"/>
         </w:rPr>
       </w:pPr>
       <w:r>
         <w:rPr>
-          <w:sz w:val="24"/>
-          <w:szCs w:val="24"/>
-        </w:rPr>
-        <w:t xml:space="preserve">According to the data the campaigns achieved little more than 50 percent of the anticipated goal. In conclusion, the campaigns achieved a lower success rate than the anticipated goal. </w:t>
+          <w:rFonts w:cstheme="minorHAnsi"/>
+          <w:b/>
+          <w:bCs/>
+          <w:sz w:val="24"/>
+          <w:szCs w:val="24"/>
+        </w:rPr>
+        <w:t xml:space="preserve">Given the </w:t>
+      </w:r>
+      <w:proofErr w:type="gramStart"/>
+      <w:r>
+        <w:rPr>
+          <w:rFonts w:cstheme="minorHAnsi"/>
+          <w:b/>
+          <w:bCs/>
+          <w:sz w:val="24"/>
+          <w:szCs w:val="24"/>
+        </w:rPr>
+        <w:t>provided data</w:t>
+      </w:r>
+      <w:proofErr w:type="gramEnd"/>
+      <w:r>
+        <w:rPr>
+          <w:rFonts w:cstheme="minorHAnsi"/>
+          <w:b/>
+          <w:bCs/>
+          <w:sz w:val="24"/>
+          <w:szCs w:val="24"/>
+        </w:rPr>
+        <w:t xml:space="preserve">, what are three conclusions that we can draw about crowdfunding campaigns? </w:t>
       </w:r>
     </w:p>
     <w:p>
       <w:pPr>
-        <w:numPr>
-          <w:ilvl w:val="0"/>
-          <w:numId w:val="1"/>
-        </w:numPr>
-        <w:spacing w:line="480" w:lineRule="auto"/>
-        <w:rPr>
+        <w:spacing w:before="100" w:beforeAutospacing="1" w:after="100" w:afterAutospacing="1" w:line="480" w:lineRule="auto"/>
+        <w:rPr>
+          <w:rFonts w:eastAsia="Times New Roman" w:cstheme="minorHAnsi"/>
           <w:sz w:val="24"/>
           <w:szCs w:val="24"/>
         </w:rPr>
       </w:pPr>
       <w:r>
         <w:rPr>
-          <w:sz w:val="24"/>
-          <w:szCs w:val="24"/>
-        </w:rPr>
-        <w:t>What are some limitations of this dataset?</w:t>
+          <w:rFonts w:eastAsia="Times New Roman" w:cstheme="minorHAnsi"/>
+          <w:sz w:val="24"/>
+          <w:szCs w:val="24"/>
+        </w:rPr>
+        <w:t>The data shows that most crowdfunding campaigns are for theater projects, especially plays, while journalism has the fewest. Theater campaigns also have the highest success rate. Additionally, July has the most successful campaigns, and September sees the fewest failures.</w:t>
       </w:r>
     </w:p>
     <w:p>
       <w:pPr>
         <w:spacing w:line="480" w:lineRule="auto"/>
-        <w:ind w:left="1080"/>
-        <w:rPr>
+        <w:rPr>
+          <w:rFonts w:cstheme="minorHAnsi"/>
+          <w:b/>
+          <w:bCs/>
           <w:sz w:val="24"/>
           <w:szCs w:val="24"/>
         </w:rPr>
       </w:pPr>
       <w:r>
         <w:rPr>
-          <w:sz w:val="24"/>
-          <w:szCs w:val="24"/>
-        </w:rPr>
-        <w:t>The data set missing the donor’s demography which will limit the audience to understand who supports crowdfunding campaigns.</w:t>
+          <w:rFonts w:cstheme="minorHAnsi"/>
+          <w:b/>
+          <w:bCs/>
+          <w:sz w:val="24"/>
+          <w:szCs w:val="24"/>
+        </w:rPr>
+        <w:t xml:space="preserve">What are some limitations of this </w:t>
+      </w:r>
+      <w:r>
+        <w:rPr>
+          <w:rFonts w:cstheme="minorHAnsi"/>
+          <w:b/>
+          <w:bCs/>
+          <w:sz w:val="24"/>
+          <w:szCs w:val="24"/>
+        </w:rPr>
+        <w:t>data set</w:t>
+      </w:r>
+      <w:r>
+        <w:rPr>
+          <w:rFonts w:cstheme="minorHAnsi"/>
+          <w:b/>
+          <w:bCs/>
+          <w:sz w:val="24"/>
+          <w:szCs w:val="24"/>
+        </w:rPr>
+        <w:t>?</w:t>
       </w:r>
     </w:p>
     <w:p>
       <w:pPr>
         <w:spacing w:line="480" w:lineRule="auto"/>
-        <w:ind w:left="1080"/>
-        <w:rPr>
+        <w:rPr>
+          <w:rFonts w:cstheme="minorHAnsi"/>
           <w:sz w:val="24"/>
           <w:szCs w:val="24"/>
         </w:rPr>
       </w:pPr>
       <w:r>
         <w:rPr>
-          <w:sz w:val="24"/>
-          <w:szCs w:val="24"/>
-        </w:rPr>
-        <w:t>The dataset may have a small sample size that might affect the findings of all crowdfunding campaigns.</w:t>
+          <w:rFonts w:cstheme="minorHAnsi"/>
+          <w:sz w:val="24"/>
+          <w:szCs w:val="24"/>
+        </w:rPr>
+        <w:t>One limitation of this dataset is the uneven representation across categories—fields like theater, music, and film/video have many projects, while others like journalism have very few. Another limitation is that it only includes a sample of crowdfunding projects, not the full dataset, which could affect the accuracy of the analysis.</w:t>
       </w:r>
     </w:p>
     <w:p>
       <w:pPr>
-        <w:numPr>
-          <w:ilvl w:val="0"/>
-          <w:numId w:val="1"/>
-        </w:numPr>
         <w:spacing w:line="480" w:lineRule="auto"/>
         <w:rPr>
+          <w:rFonts w:cstheme="minorHAnsi"/>
+          <w:b/>
+          <w:bCs/>
           <w:sz w:val="24"/>
           <w:szCs w:val="24"/>
         </w:rPr>
       </w:pPr>
       <w:r>
         <w:rPr>
+          <w:rFonts w:cstheme="minorHAnsi"/>
+          <w:b/>
+          <w:bCs/>
           <w:sz w:val="24"/>
           <w:szCs w:val="24"/>
         </w:rPr>
@@ -116,87 +199,21 @@
     <w:p>
       <w:pPr>
         <w:spacing w:line="480" w:lineRule="auto"/>
-        <w:ind w:firstLine="360"/>
-        <w:rPr>
+        <w:rPr>
+          <w:rFonts w:cstheme="minorHAnsi"/>
           <w:sz w:val="24"/>
           <w:szCs w:val="24"/>
         </w:rPr>
       </w:pPr>
       <w:r>
         <w:rPr>
-          <w:sz w:val="24"/>
-          <w:szCs w:val="24"/>
-        </w:rPr>
-        <w:t xml:space="preserve">               </w:t>
-      </w:r>
-      <w:r>
-        <w:rPr>
-          <w:sz w:val="24"/>
-          <w:szCs w:val="24"/>
-        </w:rPr>
-        <w:t xml:space="preserve">Graph that would show the backers </w:t>
-      </w:r>
-      <w:r>
-        <w:rPr>
-          <w:sz w:val="24"/>
-          <w:szCs w:val="24"/>
-        </w:rPr>
-        <w:t>demographic.</w:t>
-      </w:r>
-      <w:r>
-        <w:rPr>
-          <w:sz w:val="24"/>
-          <w:szCs w:val="24"/>
-        </w:rPr>
-        <w:t xml:space="preserve"> </w:t>
+          <w:rFonts w:cstheme="minorHAnsi"/>
+          <w:sz w:val="24"/>
+          <w:szCs w:val="24"/>
+        </w:rPr>
+        <w:t>We could create a line or bar graph showing project duration versus outcomes to explore whether longer campaigns are more successful. Another useful graph would compare project outcomes with whether they were spotlighted or marked as staff picks, helping us see if featured projects have higher success rates.</w:t>
       </w:r>
     </w:p>
-    <w:p>
-      <w:pPr>
-        <w:spacing w:line="480" w:lineRule="auto"/>
-        <w:ind w:left="720"/>
-        <w:rPr>
-          <w:sz w:val="24"/>
-          <w:szCs w:val="24"/>
-        </w:rPr>
-      </w:pPr>
-      <w:r>
-        <w:rPr>
-          <w:sz w:val="24"/>
-          <w:szCs w:val="24"/>
-        </w:rPr>
-        <w:t xml:space="preserve">       </w:t>
-      </w:r>
-      <w:r>
-        <w:rPr>
-          <w:sz w:val="24"/>
-          <w:szCs w:val="24"/>
-        </w:rPr>
-        <w:t xml:space="preserve">Graph that would show success of </w:t>
-      </w:r>
-      <w:r>
-        <w:rPr>
-          <w:sz w:val="24"/>
-          <w:szCs w:val="24"/>
-        </w:rPr>
-        <w:t xml:space="preserve">over </w:t>
-      </w:r>
-      <w:r>
-        <w:rPr>
-          <w:sz w:val="24"/>
-          <w:szCs w:val="24"/>
-        </w:rPr>
-        <w:t>time</w:t>
-      </w:r>
-      <w:r>
-        <w:rPr>
-          <w:sz w:val="24"/>
-          <w:szCs w:val="24"/>
-        </w:rPr>
-        <w:t>.</w:t>
-      </w:r>
-    </w:p>
-    <w:p/>
     <w:sectPr>
       <w:pgSz w:w="12240" w:h="15840"/>
       <w:pgMar w:top="1440" w:right="1440" w:bottom="1440" w:left="1440" w:header="720" w:footer="720" w:gutter="0"/>
@@ -208,7 +225,7 @@
 </file>
 
 <file path=word/numbering.xml><?xml version="1.0" encoding="utf-8"?>
-<w:numbering xmlns:wpc="http://schemas.microsoft.com/office/word/2010/wordprocessingCanvas" xmlns:cx="http://schemas.microsoft.com/office/drawing/2014/chartex" xmlns:cx1="http://schemas.microsoft.com/office/drawing/2015/9/8/chartex" xmlns:cx2="http://schemas.microsoft.com/office/drawing/2015/10/21/chartex" xmlns:cx3="http://schemas.microsoft.com/office/drawing/2016/5/9/chartex" xmlns:cx4="http://schemas.microsoft.com/office/drawing/2016/5/10/chartex" xmlns:cx5="http://schemas.microsoft.com/office/drawing/2016/5/11/chartex" xmlns:cx6="http://schemas.microsoft.com/office/drawing/2016/5/12/chartex" xmlns:cx7="http://schemas.microsoft.com/office/drawing/2016/5/13/chartex" xmlns:cx8="http://schemas.microsoft.com/office/drawing/2016/5/14/chartex" xmlns:mc="http://schemas.openxmlformats.org/markup-compatibility/2006" xmlns:aink="http://schemas.microsoft.com/office/drawing/2016/ink" xmlns:am3d="http://schemas.microsoft.com/office/drawing/2017/model3d" xmlns:o="urn:schemas-microsoft-com:office:office" xmlns:oel="http://schemas.microsoft.com/office/2019/extlst" xmlns:r="http://schemas.openxmlformats.org/officeDocument/2006/relationships" xmlns:m="http://schemas.openxmlformats.org/officeDocument/2006/math" xmlns:v="urn:schemas-microsoft-com:vml" xmlns:wp14="http://schemas.microsoft.com/office/word/2010/wordprocessingDrawing" xmlns:wp="http://schemas.openxmlformats.org/drawingml/2006/wordprocessingDrawing" xmlns:w10="urn:schemas-microsoft-com:office:word" xmlns:w="http://schemas.openxmlformats.org/wordprocessingml/2006/main" xmlns:w14="http://schemas.microsoft.com/office/word/2010/wordml" xmlns:w15="http://schemas.microsoft.com/office/word/2012/wordml" xmlns:w16cex="http://schemas.microsoft.com/office/word/2018/wordml/cex" xmlns:w16cid="http://schemas.microsoft.com/office/word/2016/wordml/cid" xmlns:w16="http://schemas.microsoft.com/office/word/2018/wordml" xmlns:w16du="http://schemas.microsoft.com/office/word/2023/wordml/word16du" xmlns:w16sdtdh="http://schemas.microsoft.com/office/word/2020/wordml/sdtdatahash" xmlns:w16se="http://schemas.microsoft.com/office/word/2015/wordml/symex" xmlns:wpg="http://schemas.microsoft.com/office/word/2010/wordprocessingGroup" xmlns:wpi="http://schemas.microsoft.com/office/word/2010/wordprocessingInk" xmlns:wne="http://schemas.microsoft.com/office/word/2006/wordml" xmlns:wps="http://schemas.microsoft.com/office/word/2010/wordprocessingShape" mc:Ignorable="w14 w15 w16se w16cid w16 w16cex w16sdtdh w16du wp14">
+<w:numbering xmlns:wpc="http://schemas.microsoft.com/office/word/2010/wordprocessingCanvas" xmlns:cx="http://schemas.microsoft.com/office/drawing/2014/chartex" xmlns:cx1="http://schemas.microsoft.com/office/drawing/2015/9/8/chartex" xmlns:cx2="http://schemas.microsoft.com/office/drawing/2015/10/21/chartex" xmlns:cx3="http://schemas.microsoft.com/office/drawing/2016/5/9/chartex" xmlns:cx4="http://schemas.microsoft.com/office/drawing/2016/5/10/chartex" xmlns:cx5="http://schemas.microsoft.com/office/drawing/2016/5/11/chartex" xmlns:cx6="http://schemas.microsoft.com/office/drawing/2016/5/12/chartex" xmlns:cx7="http://schemas.microsoft.com/office/drawing/2016/5/13/chartex" xmlns:cx8="http://schemas.microsoft.com/office/drawing/2016/5/14/chartex" xmlns:mc="http://schemas.openxmlformats.org/markup-compatibility/2006" xmlns:aink="http://schemas.microsoft.com/office/drawing/2016/ink" xmlns:am3d="http://schemas.microsoft.com/office/drawing/2017/model3d" xmlns:o="urn:schemas-microsoft-com:office:office" xmlns:oel="http://schemas.microsoft.com/office/2019/extlst" xmlns:r="http://schemas.openxmlformats.org/officeDocument/2006/relationships" xmlns:m="http://schemas.openxmlformats.org/officeDocument/2006/math" xmlns:v="urn:schemas-microsoft-com:vml" xmlns:wp14="http://schemas.microsoft.com/office/word/2010/wordprocessingDrawing" xmlns:wp="http://schemas.openxmlformats.org/drawingml/2006/wordprocessingDrawing" xmlns:w10="urn:schemas-microsoft-com:office:word" xmlns:w="http://schemas.openxmlformats.org/wordprocessingml/2006/main" xmlns:w14="http://schemas.microsoft.com/office/word/2010/wordml" xmlns:w15="http://schemas.microsoft.com/office/word/2012/wordml" xmlns:w16cex="http://schemas.microsoft.com/office/word/2018/wordml/cex" xmlns:w16cid="http://schemas.microsoft.com/office/word/2016/wordml/cid" xmlns:w16="http://schemas.microsoft.com/office/word/2018/wordml" xmlns:w16du="http://schemas.microsoft.com/office/word/2023/wordml/word16du" xmlns:w16sdtdh="http://schemas.microsoft.com/office/word/2020/wordml/sdtdatahash" xmlns:w16sdtfl="http://schemas.microsoft.com/office/word/2024/wordml/sdtformatlock" xmlns:w16se="http://schemas.microsoft.com/office/word/2015/wordml/symex" xmlns:wpg="http://schemas.microsoft.com/office/word/2010/wordprocessingGroup" xmlns:wpi="http://schemas.microsoft.com/office/word/2010/wordprocessingInk" xmlns:wne="http://schemas.microsoft.com/office/word/2006/wordml" xmlns:wps="http://schemas.microsoft.com/office/word/2010/wordprocessingShape" mc:Ignorable="w14 w15 w16se w16cid w16 w16cex w16sdtdh w16sdtfl w16du wp14">
   <w:abstractNum w:abstractNumId="0" w15:restartNumberingAfterBreak="0">
     <w:nsid w:val="281D09B5"/>
     <w:multiLevelType w:val="multilevel"/>
@@ -517,7 +534,7 @@
 </file>
 
 <file path=word/styles.xml><?xml version="1.0" encoding="utf-8"?>
-<w:styles xmlns:mc="http://schemas.openxmlformats.org/markup-compatibility/2006" xmlns:r="http://schemas.openxmlformats.org/officeDocument/2006/relationships" xmlns:w="http://schemas.openxmlformats.org/wordprocessingml/2006/main" xmlns:w14="http://schemas.microsoft.com/office/word/2010/wordml" xmlns:w15="http://schemas.microsoft.com/office/word/2012/wordml" xmlns:w16cex="http://schemas.microsoft.com/office/word/2018/wordml/cex" xmlns:w16cid="http://schemas.microsoft.com/office/word/2016/wordml/cid" xmlns:w16="http://schemas.microsoft.com/office/word/2018/wordml" xmlns:w16du="http://schemas.microsoft.com/office/word/2023/wordml/word16du" xmlns:w16sdtdh="http://schemas.microsoft.com/office/word/2020/wordml/sdtdatahash" xmlns:w16se="http://schemas.microsoft.com/office/word/2015/wordml/symex" mc:Ignorable="w14 w15 w16se w16cid w16 w16cex w16sdtdh w16du">
+<w:styles xmlns:mc="http://schemas.openxmlformats.org/markup-compatibility/2006" xmlns:r="http://schemas.openxmlformats.org/officeDocument/2006/relationships" xmlns:w="http://schemas.openxmlformats.org/wordprocessingml/2006/main" xmlns:w14="http://schemas.microsoft.com/office/word/2010/wordml" xmlns:w15="http://schemas.microsoft.com/office/word/2012/wordml" xmlns:w16cex="http://schemas.microsoft.com/office/word/2018/wordml/cex" xmlns:w16cid="http://schemas.microsoft.com/office/word/2016/wordml/cid" xmlns:w16="http://schemas.microsoft.com/office/word/2018/wordml" xmlns:w16du="http://schemas.microsoft.com/office/word/2023/wordml/word16du" xmlns:w16sdtdh="http://schemas.microsoft.com/office/word/2020/wordml/sdtdatahash" xmlns:w16sdtfl="http://schemas.microsoft.com/office/word/2024/wordml/sdtformatlock" xmlns:w16se="http://schemas.microsoft.com/office/word/2015/wordml/symex" mc:Ignorable="w14 w15 w16se w16cid w16 w16cex w16sdtdh w16sdtfl w16du">
   <w:docDefaults>
     <w:rPrDefault>
       <w:rPr>

</xml_diff>